<commit_message>
Add privacy policy and terms of service page: create policy.html with content and styling, update routes in main.py, and adjust links in index.html
</commit_message>
<xml_diff>
--- a/documentation/asset log.docx
+++ b/documentation/asset log.docx
@@ -149,8 +149,18 @@
                 <w:sz w:val="22"/>
                 <w:szCs w:val="22"/>
               </w:rPr>
-              <w:t>imported datetime import datetime, timedelta</w:t>
-            </w:r>
+              <w:t xml:space="preserve">imported datetime import datetime, </w:t>
+            </w:r>
+            <w:proofErr w:type="spellStart"/>
+            <w:r>
+              <w:rPr>
+                <w:color w:val="000000" w:themeColor="text1"/>
+                <w:sz w:val="22"/>
+                <w:szCs w:val="22"/>
+              </w:rPr>
+              <w:t>timedelta</w:t>
+            </w:r>
+            <w:proofErr w:type="spellEnd"/>
           </w:p>
         </w:tc>
         <w:tc>
@@ -261,8 +271,18 @@
                 <w:sz w:val="22"/>
                 <w:szCs w:val="22"/>
               </w:rPr>
-              <w:t>import os</w:t>
-            </w:r>
+              <w:t xml:space="preserve">import </w:t>
+            </w:r>
+            <w:proofErr w:type="spellStart"/>
+            <w:r>
+              <w:rPr>
+                <w:color w:val="000000" w:themeColor="text1"/>
+                <w:sz w:val="22"/>
+                <w:szCs w:val="22"/>
+              </w:rPr>
+              <w:t>os</w:t>
+            </w:r>
+            <w:proofErr w:type="spellEnd"/>
           </w:p>
         </w:tc>
         <w:tc>
@@ -485,7 +505,97 @@
                 <w:sz w:val="22"/>
                 <w:szCs w:val="22"/>
               </w:rPr>
-              <w:t>from flask import Flask, jsonify, make_response,redirect, render_template,    request, send_from_directory, session, url_for,</w:t>
+              <w:t xml:space="preserve">from flask import Flask, </w:t>
+            </w:r>
+            <w:proofErr w:type="spellStart"/>
+            <w:r>
+              <w:rPr>
+                <w:color w:val="000000" w:themeColor="text1"/>
+                <w:sz w:val="22"/>
+                <w:szCs w:val="22"/>
+              </w:rPr>
+              <w:t>jsonify</w:t>
+            </w:r>
+            <w:proofErr w:type="spellEnd"/>
+            <w:r>
+              <w:rPr>
+                <w:color w:val="000000" w:themeColor="text1"/>
+                <w:sz w:val="22"/>
+                <w:szCs w:val="22"/>
+              </w:rPr>
+              <w:t xml:space="preserve">, </w:t>
+            </w:r>
+            <w:proofErr w:type="spellStart"/>
+            <w:r>
+              <w:rPr>
+                <w:color w:val="000000" w:themeColor="text1"/>
+                <w:sz w:val="22"/>
+                <w:szCs w:val="22"/>
+              </w:rPr>
+              <w:t>make_response,redirect</w:t>
+            </w:r>
+            <w:proofErr w:type="spellEnd"/>
+            <w:r>
+              <w:rPr>
+                <w:color w:val="000000" w:themeColor="text1"/>
+                <w:sz w:val="22"/>
+                <w:szCs w:val="22"/>
+              </w:rPr>
+              <w:t xml:space="preserve">, </w:t>
+            </w:r>
+            <w:proofErr w:type="spellStart"/>
+            <w:r>
+              <w:rPr>
+                <w:color w:val="000000" w:themeColor="text1"/>
+                <w:sz w:val="22"/>
+                <w:szCs w:val="22"/>
+              </w:rPr>
+              <w:t>render_template</w:t>
+            </w:r>
+            <w:proofErr w:type="spellEnd"/>
+            <w:r>
+              <w:rPr>
+                <w:color w:val="000000" w:themeColor="text1"/>
+                <w:sz w:val="22"/>
+                <w:szCs w:val="22"/>
+              </w:rPr>
+              <w:t xml:space="preserve">,    request, </w:t>
+            </w:r>
+            <w:proofErr w:type="spellStart"/>
+            <w:r>
+              <w:rPr>
+                <w:color w:val="000000" w:themeColor="text1"/>
+                <w:sz w:val="22"/>
+                <w:szCs w:val="22"/>
+              </w:rPr>
+              <w:t>send_from_directory</w:t>
+            </w:r>
+            <w:proofErr w:type="spellEnd"/>
+            <w:r>
+              <w:rPr>
+                <w:color w:val="000000" w:themeColor="text1"/>
+                <w:sz w:val="22"/>
+                <w:szCs w:val="22"/>
+              </w:rPr>
+              <w:t xml:space="preserve">, session, </w:t>
+            </w:r>
+            <w:proofErr w:type="spellStart"/>
+            <w:r>
+              <w:rPr>
+                <w:color w:val="000000" w:themeColor="text1"/>
+                <w:sz w:val="22"/>
+                <w:szCs w:val="22"/>
+              </w:rPr>
+              <w:t>url_for</w:t>
+            </w:r>
+            <w:proofErr w:type="spellEnd"/>
+            <w:r>
+              <w:rPr>
+                <w:color w:val="000000" w:themeColor="text1"/>
+                <w:sz w:val="22"/>
+                <w:szCs w:val="22"/>
+              </w:rPr>
+              <w:t>,</w:t>
             </w:r>
           </w:p>
         </w:tc>
@@ -712,8 +822,59 @@
                 <w:sz w:val="22"/>
                 <w:szCs w:val="22"/>
               </w:rPr>
-              <w:t>from werkzeug.security import generate_password_hash, check_password_hash</w:t>
-            </w:r>
+              <w:t xml:space="preserve">from </w:t>
+            </w:r>
+            <w:proofErr w:type="spellStart"/>
+            <w:r>
+              <w:rPr>
+                <w:rFonts w:ascii="Consolas" w:hAnsi="Consolas"/>
+                <w:color w:val="000000" w:themeColor="text1"/>
+                <w:sz w:val="22"/>
+                <w:szCs w:val="22"/>
+              </w:rPr>
+              <w:t>werkzeug.security</w:t>
+            </w:r>
+            <w:proofErr w:type="spellEnd"/>
+            <w:r>
+              <w:rPr>
+                <w:rFonts w:ascii="Consolas" w:hAnsi="Consolas"/>
+                <w:color w:val="000000" w:themeColor="text1"/>
+                <w:sz w:val="22"/>
+                <w:szCs w:val="22"/>
+              </w:rPr>
+              <w:t xml:space="preserve"> import </w:t>
+            </w:r>
+            <w:proofErr w:type="spellStart"/>
+            <w:r>
+              <w:rPr>
+                <w:rFonts w:ascii="Consolas" w:hAnsi="Consolas"/>
+                <w:color w:val="000000" w:themeColor="text1"/>
+                <w:sz w:val="22"/>
+                <w:szCs w:val="22"/>
+              </w:rPr>
+              <w:t>generate_password_hash</w:t>
+            </w:r>
+            <w:proofErr w:type="spellEnd"/>
+            <w:r>
+              <w:rPr>
+                <w:rFonts w:ascii="Consolas" w:hAnsi="Consolas"/>
+                <w:color w:val="000000" w:themeColor="text1"/>
+                <w:sz w:val="22"/>
+                <w:szCs w:val="22"/>
+              </w:rPr>
+              <w:t xml:space="preserve">, </w:t>
+            </w:r>
+            <w:proofErr w:type="spellStart"/>
+            <w:r>
+              <w:rPr>
+                <w:rFonts w:ascii="Consolas" w:hAnsi="Consolas"/>
+                <w:color w:val="000000" w:themeColor="text1"/>
+                <w:sz w:val="22"/>
+                <w:szCs w:val="22"/>
+              </w:rPr>
+              <w:t>check_password_hash</w:t>
+            </w:r>
+            <w:proofErr w:type="spellEnd"/>
           </w:p>
         </w:tc>
         <w:tc>
@@ -757,7 +918,25 @@
                 <w:sz w:val="22"/>
                 <w:szCs w:val="22"/>
               </w:rPr>
-              <w:t>Pip installed werzeug library</w:t>
+              <w:t xml:space="preserve">Pip installed </w:t>
+            </w:r>
+            <w:proofErr w:type="spellStart"/>
+            <w:r>
+              <w:rPr>
+                <w:color w:val="000000" w:themeColor="text1"/>
+                <w:sz w:val="22"/>
+                <w:szCs w:val="22"/>
+              </w:rPr>
+              <w:t>werzeug</w:t>
+            </w:r>
+            <w:proofErr w:type="spellEnd"/>
+            <w:r>
+              <w:rPr>
+                <w:color w:val="000000" w:themeColor="text1"/>
+                <w:sz w:val="22"/>
+                <w:szCs w:val="22"/>
+              </w:rPr>
+              <w:t xml:space="preserve"> library</w:t>
             </w:r>
           </w:p>
         </w:tc>
@@ -830,7 +1009,7 @@
                 <w:szCs w:val="22"/>
               </w:rPr>
               <w:drawing>
-                <wp:anchor distT="0" distB="0" distL="114300" distR="114300" simplePos="0" relativeHeight="251659264" behindDoc="0" locked="0" layoutInCell="1" allowOverlap="1" wp14:anchorId="7712C721" wp14:editId="0901E1BA">
+                <wp:anchor distT="0" distB="0" distL="114300" distR="114300" simplePos="0" relativeHeight="251659264" behindDoc="0" locked="0" layoutInCell="1" allowOverlap="1" wp14:anchorId="7712C721" wp14:editId="294CF2A5">
                   <wp:simplePos x="0" y="0"/>
                   <wp:positionH relativeFrom="column">
                     <wp:posOffset>1056668</wp:posOffset>
@@ -985,7 +1164,43 @@
                 <w:sz w:val="22"/>
                 <w:szCs w:val="22"/>
               </w:rPr>
-              <w:t xml:space="preserve">Created in microsoft paint app, sephiscop icon was grabbed from </w:t>
+              <w:t xml:space="preserve">Created in </w:t>
+            </w:r>
+            <w:proofErr w:type="spellStart"/>
+            <w:r>
+              <w:rPr>
+                <w:color w:val="000000" w:themeColor="text1"/>
+                <w:sz w:val="22"/>
+                <w:szCs w:val="22"/>
+              </w:rPr>
+              <w:t>microsoft</w:t>
+            </w:r>
+            <w:proofErr w:type="spellEnd"/>
+            <w:r>
+              <w:rPr>
+                <w:color w:val="000000" w:themeColor="text1"/>
+                <w:sz w:val="22"/>
+                <w:szCs w:val="22"/>
+              </w:rPr>
+              <w:t xml:space="preserve"> paint app, </w:t>
+            </w:r>
+            <w:proofErr w:type="spellStart"/>
+            <w:r>
+              <w:rPr>
+                <w:color w:val="000000" w:themeColor="text1"/>
+                <w:sz w:val="22"/>
+                <w:szCs w:val="22"/>
+              </w:rPr>
+              <w:t>sephiscop</w:t>
+            </w:r>
+            <w:proofErr w:type="spellEnd"/>
+            <w:r>
+              <w:rPr>
+                <w:color w:val="000000" w:themeColor="text1"/>
+                <w:sz w:val="22"/>
+                <w:szCs w:val="22"/>
+              </w:rPr>
+              <w:t xml:space="preserve"> icon was grabbed from </w:t>
             </w:r>
             <w:hyperlink r:id="rId9" w:history="1">
               <w:r>
@@ -994,8 +1209,18 @@
                   <w:sz w:val="22"/>
                   <w:szCs w:val="22"/>
                 </w:rPr>
-                <w:t>"Stethoscope" Icon - Download for free – Iconduck</w:t>
+                <w:t xml:space="preserve">"Stethoscope" Icon - Download for free – </w:t>
               </w:r>
+              <w:proofErr w:type="spellStart"/>
+              <w:r>
+                <w:rPr>
+                  <w:rStyle w:val="Hyperlink"/>
+                  <w:sz w:val="22"/>
+                  <w:szCs w:val="22"/>
+                </w:rPr>
+                <w:t>Iconduck</w:t>
+              </w:r>
+              <w:proofErr w:type="spellEnd"/>
             </w:hyperlink>
           </w:p>
         </w:tc>
@@ -1075,39 +1300,121 @@
                 <w:szCs w:val="22"/>
               </w:rPr>
             </w:pPr>
-            <w:r>
-              <w:rPr>
-                <w:color w:val="000000" w:themeColor="text1"/>
-                <w:sz w:val="22"/>
-                <w:szCs w:val="22"/>
-              </w:rPr>
-              <w:t>modifed sidbar css from the w3school /* sidenav Styles */</w:t>
-            </w:r>
-          </w:p>
-          <w:p>
-            <w:pPr>
-              <w:rPr>
-                <w:color w:val="000000" w:themeColor="text1"/>
-                <w:sz w:val="22"/>
-                <w:szCs w:val="22"/>
-              </w:rPr>
-            </w:pPr>
-          </w:p>
-          <w:p>
-            <w:pPr>
-              <w:rPr>
-                <w:color w:val="000000" w:themeColor="text1"/>
-                <w:sz w:val="22"/>
-                <w:szCs w:val="22"/>
-              </w:rPr>
-            </w:pPr>
-            <w:r>
-              <w:rPr>
-                <w:color w:val="000000" w:themeColor="text1"/>
-                <w:sz w:val="22"/>
-                <w:szCs w:val="22"/>
-              </w:rPr>
-              <w:t>.sidenav h2 {</w:t>
+            <w:proofErr w:type="spellStart"/>
+            <w:r>
+              <w:rPr>
+                <w:color w:val="000000" w:themeColor="text1"/>
+                <w:sz w:val="22"/>
+                <w:szCs w:val="22"/>
+              </w:rPr>
+              <w:t>modifed</w:t>
+            </w:r>
+            <w:proofErr w:type="spellEnd"/>
+            <w:r>
+              <w:rPr>
+                <w:color w:val="000000" w:themeColor="text1"/>
+                <w:sz w:val="22"/>
+                <w:szCs w:val="22"/>
+              </w:rPr>
+              <w:t xml:space="preserve"> </w:t>
+            </w:r>
+            <w:proofErr w:type="spellStart"/>
+            <w:r>
+              <w:rPr>
+                <w:color w:val="000000" w:themeColor="text1"/>
+                <w:sz w:val="22"/>
+                <w:szCs w:val="22"/>
+              </w:rPr>
+              <w:t>sidbar</w:t>
+            </w:r>
+            <w:proofErr w:type="spellEnd"/>
+            <w:r>
+              <w:rPr>
+                <w:color w:val="000000" w:themeColor="text1"/>
+                <w:sz w:val="22"/>
+                <w:szCs w:val="22"/>
+              </w:rPr>
+              <w:t xml:space="preserve"> </w:t>
+            </w:r>
+            <w:proofErr w:type="spellStart"/>
+            <w:r>
+              <w:rPr>
+                <w:color w:val="000000" w:themeColor="text1"/>
+                <w:sz w:val="22"/>
+                <w:szCs w:val="22"/>
+              </w:rPr>
+              <w:t>css</w:t>
+            </w:r>
+            <w:proofErr w:type="spellEnd"/>
+            <w:r>
+              <w:rPr>
+                <w:color w:val="000000" w:themeColor="text1"/>
+                <w:sz w:val="22"/>
+                <w:szCs w:val="22"/>
+              </w:rPr>
+              <w:t xml:space="preserve"> from the w3school /* </w:t>
+            </w:r>
+            <w:proofErr w:type="spellStart"/>
+            <w:r>
+              <w:rPr>
+                <w:color w:val="000000" w:themeColor="text1"/>
+                <w:sz w:val="22"/>
+                <w:szCs w:val="22"/>
+              </w:rPr>
+              <w:t>sidenav</w:t>
+            </w:r>
+            <w:proofErr w:type="spellEnd"/>
+            <w:r>
+              <w:rPr>
+                <w:color w:val="000000" w:themeColor="text1"/>
+                <w:sz w:val="22"/>
+                <w:szCs w:val="22"/>
+              </w:rPr>
+              <w:t xml:space="preserve"> Styles */</w:t>
+            </w:r>
+          </w:p>
+          <w:p>
+            <w:pPr>
+              <w:rPr>
+                <w:color w:val="000000" w:themeColor="text1"/>
+                <w:sz w:val="22"/>
+                <w:szCs w:val="22"/>
+              </w:rPr>
+            </w:pPr>
+          </w:p>
+          <w:p>
+            <w:pPr>
+              <w:rPr>
+                <w:color w:val="000000" w:themeColor="text1"/>
+                <w:sz w:val="22"/>
+                <w:szCs w:val="22"/>
+              </w:rPr>
+            </w:pPr>
+            <w:r>
+              <w:rPr>
+                <w:color w:val="000000" w:themeColor="text1"/>
+                <w:sz w:val="22"/>
+                <w:szCs w:val="22"/>
+              </w:rPr>
+              <w:t>.</w:t>
+            </w:r>
+            <w:proofErr w:type="spellStart"/>
+            <w:r>
+              <w:rPr>
+                <w:color w:val="000000" w:themeColor="text1"/>
+                <w:sz w:val="22"/>
+                <w:szCs w:val="22"/>
+              </w:rPr>
+              <w:t>sidenav</w:t>
+            </w:r>
+            <w:proofErr w:type="spellEnd"/>
+            <w:r>
+              <w:rPr>
+                <w:color w:val="000000" w:themeColor="text1"/>
+                <w:sz w:val="22"/>
+                <w:szCs w:val="22"/>
+              </w:rPr>
+              <w:t xml:space="preserve"> h2 {</w:t>
             </w:r>
           </w:p>
           <w:p>
@@ -1184,7 +1491,25 @@
                 <w:sz w:val="22"/>
                 <w:szCs w:val="22"/>
               </w:rPr>
-              <w:t>.sidenav a {</w:t>
+              <w:t>.</w:t>
+            </w:r>
+            <w:proofErr w:type="spellStart"/>
+            <w:r>
+              <w:rPr>
+                <w:color w:val="000000" w:themeColor="text1"/>
+                <w:sz w:val="22"/>
+                <w:szCs w:val="22"/>
+              </w:rPr>
+              <w:t>sidenav</w:t>
+            </w:r>
+            <w:proofErr w:type="spellEnd"/>
+            <w:r>
+              <w:rPr>
+                <w:color w:val="000000" w:themeColor="text1"/>
+                <w:sz w:val="22"/>
+                <w:szCs w:val="22"/>
+              </w:rPr>
+              <w:t xml:space="preserve"> a {</w:t>
             </w:r>
           </w:p>
           <w:p>
@@ -1252,7 +1577,25 @@
                 <w:sz w:val="22"/>
                 <w:szCs w:val="22"/>
               </w:rPr>
-              <w:t>  color: #818181;</w:t>
+              <w:t xml:space="preserve">  </w:t>
+            </w:r>
+            <w:proofErr w:type="spellStart"/>
+            <w:r>
+              <w:rPr>
+                <w:color w:val="000000" w:themeColor="text1"/>
+                <w:sz w:val="22"/>
+                <w:szCs w:val="22"/>
+              </w:rPr>
+              <w:t>color</w:t>
+            </w:r>
+            <w:proofErr w:type="spellEnd"/>
+            <w:r>
+              <w:rPr>
+                <w:color w:val="000000" w:themeColor="text1"/>
+                <w:sz w:val="22"/>
+                <w:szCs w:val="22"/>
+              </w:rPr>
+              <w:t>: #818181;</w:t>
             </w:r>
           </w:p>
           <w:p>
@@ -1312,24 +1655,60 @@
                 <w:sz w:val="22"/>
                 <w:szCs w:val="22"/>
               </w:rPr>
-              <w:t>.sidenav a:hover {</w:t>
-            </w:r>
-          </w:p>
-          <w:p>
-            <w:pPr>
-              <w:rPr>
-                <w:color w:val="000000" w:themeColor="text1"/>
-                <w:sz w:val="22"/>
-                <w:szCs w:val="22"/>
-              </w:rPr>
-            </w:pPr>
-            <w:r>
-              <w:rPr>
-                <w:color w:val="000000" w:themeColor="text1"/>
-                <w:sz w:val="22"/>
-                <w:szCs w:val="22"/>
-              </w:rPr>
-              <w:t>  color: #f1f1f1;</w:t>
+              <w:t>.</w:t>
+            </w:r>
+            <w:proofErr w:type="spellStart"/>
+            <w:r>
+              <w:rPr>
+                <w:color w:val="000000" w:themeColor="text1"/>
+                <w:sz w:val="22"/>
+                <w:szCs w:val="22"/>
+              </w:rPr>
+              <w:t>sidenav</w:t>
+            </w:r>
+            <w:proofErr w:type="spellEnd"/>
+            <w:r>
+              <w:rPr>
+                <w:color w:val="000000" w:themeColor="text1"/>
+                <w:sz w:val="22"/>
+                <w:szCs w:val="22"/>
+              </w:rPr>
+              <w:t xml:space="preserve"> a:hover {</w:t>
+            </w:r>
+          </w:p>
+          <w:p>
+            <w:pPr>
+              <w:rPr>
+                <w:color w:val="000000" w:themeColor="text1"/>
+                <w:sz w:val="22"/>
+                <w:szCs w:val="22"/>
+              </w:rPr>
+            </w:pPr>
+            <w:r>
+              <w:rPr>
+                <w:color w:val="000000" w:themeColor="text1"/>
+                <w:sz w:val="22"/>
+                <w:szCs w:val="22"/>
+              </w:rPr>
+              <w:t xml:space="preserve">  </w:t>
+            </w:r>
+            <w:proofErr w:type="spellStart"/>
+            <w:r>
+              <w:rPr>
+                <w:color w:val="000000" w:themeColor="text1"/>
+                <w:sz w:val="22"/>
+                <w:szCs w:val="22"/>
+              </w:rPr>
+              <w:t>color</w:t>
+            </w:r>
+            <w:proofErr w:type="spellEnd"/>
+            <w:r>
+              <w:rPr>
+                <w:color w:val="000000" w:themeColor="text1"/>
+                <w:sz w:val="22"/>
+                <w:szCs w:val="22"/>
+              </w:rPr>
+              <w:t>: #f1f1f1;</w:t>
             </w:r>
           </w:p>
           <w:p>
@@ -1372,7 +1751,25 @@
                 <w:sz w:val="22"/>
                 <w:szCs w:val="22"/>
               </w:rPr>
-              <w:t>.sidenav form {</w:t>
+              <w:t>.</w:t>
+            </w:r>
+            <w:proofErr w:type="spellStart"/>
+            <w:r>
+              <w:rPr>
+                <w:color w:val="000000" w:themeColor="text1"/>
+                <w:sz w:val="22"/>
+                <w:szCs w:val="22"/>
+              </w:rPr>
+              <w:t>sidenav</w:t>
+            </w:r>
+            <w:proofErr w:type="spellEnd"/>
+            <w:r>
+              <w:rPr>
+                <w:color w:val="000000" w:themeColor="text1"/>
+                <w:sz w:val="22"/>
+                <w:szCs w:val="22"/>
+              </w:rPr>
+              <w:t xml:space="preserve"> form {</w:t>
             </w:r>
           </w:p>
           <w:p>
@@ -1433,24 +1830,60 @@
                 <w:sz w:val="22"/>
                 <w:szCs w:val="22"/>
               </w:rPr>
-              <w:t>.sidenav input,</w:t>
-            </w:r>
-          </w:p>
-          <w:p>
-            <w:pPr>
-              <w:rPr>
-                <w:color w:val="000000" w:themeColor="text1"/>
-                <w:sz w:val="22"/>
-                <w:szCs w:val="22"/>
-              </w:rPr>
-            </w:pPr>
-            <w:r>
-              <w:rPr>
-                <w:color w:val="000000" w:themeColor="text1"/>
-                <w:sz w:val="22"/>
-                <w:szCs w:val="22"/>
-              </w:rPr>
-              <w:t>.sidenav select {</w:t>
+              <w:t>.</w:t>
+            </w:r>
+            <w:proofErr w:type="spellStart"/>
+            <w:r>
+              <w:rPr>
+                <w:color w:val="000000" w:themeColor="text1"/>
+                <w:sz w:val="22"/>
+                <w:szCs w:val="22"/>
+              </w:rPr>
+              <w:t>sidenav</w:t>
+            </w:r>
+            <w:proofErr w:type="spellEnd"/>
+            <w:r>
+              <w:rPr>
+                <w:color w:val="000000" w:themeColor="text1"/>
+                <w:sz w:val="22"/>
+                <w:szCs w:val="22"/>
+              </w:rPr>
+              <w:t xml:space="preserve"> input,</w:t>
+            </w:r>
+          </w:p>
+          <w:p>
+            <w:pPr>
+              <w:rPr>
+                <w:color w:val="000000" w:themeColor="text1"/>
+                <w:sz w:val="22"/>
+                <w:szCs w:val="22"/>
+              </w:rPr>
+            </w:pPr>
+            <w:r>
+              <w:rPr>
+                <w:color w:val="000000" w:themeColor="text1"/>
+                <w:sz w:val="22"/>
+                <w:szCs w:val="22"/>
+              </w:rPr>
+              <w:t>.</w:t>
+            </w:r>
+            <w:proofErr w:type="spellStart"/>
+            <w:r>
+              <w:rPr>
+                <w:color w:val="000000" w:themeColor="text1"/>
+                <w:sz w:val="22"/>
+                <w:szCs w:val="22"/>
+              </w:rPr>
+              <w:t>sidenav</w:t>
+            </w:r>
+            <w:proofErr w:type="spellEnd"/>
+            <w:r>
+              <w:rPr>
+                <w:color w:val="000000" w:themeColor="text1"/>
+                <w:sz w:val="22"/>
+                <w:szCs w:val="22"/>
+              </w:rPr>
+              <w:t xml:space="preserve"> select {</w:t>
             </w:r>
           </w:p>
           <w:p>
@@ -1544,7 +1977,25 @@
                 <w:sz w:val="22"/>
                 <w:szCs w:val="22"/>
               </w:rPr>
-              <w:t>.sidenav button {</w:t>
+              <w:t>.</w:t>
+            </w:r>
+            <w:proofErr w:type="spellStart"/>
+            <w:r>
+              <w:rPr>
+                <w:color w:val="000000" w:themeColor="text1"/>
+                <w:sz w:val="22"/>
+                <w:szCs w:val="22"/>
+              </w:rPr>
+              <w:t>sidenav</w:t>
+            </w:r>
+            <w:proofErr w:type="spellEnd"/>
+            <w:r>
+              <w:rPr>
+                <w:color w:val="000000" w:themeColor="text1"/>
+                <w:sz w:val="22"/>
+                <w:szCs w:val="22"/>
+              </w:rPr>
+              <w:t xml:space="preserve"> button {</w:t>
             </w:r>
           </w:p>
           <w:p>
@@ -1595,24 +2046,60 @@
                 <w:sz w:val="22"/>
                 <w:szCs w:val="22"/>
               </w:rPr>
-              <w:t>  background-color: #0098DB;</w:t>
-            </w:r>
-          </w:p>
-          <w:p>
-            <w:pPr>
-              <w:rPr>
-                <w:color w:val="000000" w:themeColor="text1"/>
-                <w:sz w:val="22"/>
-                <w:szCs w:val="22"/>
-              </w:rPr>
-            </w:pPr>
-            <w:r>
-              <w:rPr>
-                <w:color w:val="000000" w:themeColor="text1"/>
-                <w:sz w:val="22"/>
-                <w:szCs w:val="22"/>
-              </w:rPr>
-              <w:t>  color: white;</w:t>
+              <w:t>  background-</w:t>
+            </w:r>
+            <w:proofErr w:type="spellStart"/>
+            <w:r>
+              <w:rPr>
+                <w:color w:val="000000" w:themeColor="text1"/>
+                <w:sz w:val="22"/>
+                <w:szCs w:val="22"/>
+              </w:rPr>
+              <w:t>color</w:t>
+            </w:r>
+            <w:proofErr w:type="spellEnd"/>
+            <w:r>
+              <w:rPr>
+                <w:color w:val="000000" w:themeColor="text1"/>
+                <w:sz w:val="22"/>
+                <w:szCs w:val="22"/>
+              </w:rPr>
+              <w:t>: #0098DB;</w:t>
+            </w:r>
+          </w:p>
+          <w:p>
+            <w:pPr>
+              <w:rPr>
+                <w:color w:val="000000" w:themeColor="text1"/>
+                <w:sz w:val="22"/>
+                <w:szCs w:val="22"/>
+              </w:rPr>
+            </w:pPr>
+            <w:r>
+              <w:rPr>
+                <w:color w:val="000000" w:themeColor="text1"/>
+                <w:sz w:val="22"/>
+                <w:szCs w:val="22"/>
+              </w:rPr>
+              <w:t xml:space="preserve">  </w:t>
+            </w:r>
+            <w:proofErr w:type="spellStart"/>
+            <w:r>
+              <w:rPr>
+                <w:color w:val="000000" w:themeColor="text1"/>
+                <w:sz w:val="22"/>
+                <w:szCs w:val="22"/>
+              </w:rPr>
+              <w:t>color</w:t>
+            </w:r>
+            <w:proofErr w:type="spellEnd"/>
+            <w:r>
+              <w:rPr>
+                <w:color w:val="000000" w:themeColor="text1"/>
+                <w:sz w:val="22"/>
+                <w:szCs w:val="22"/>
+              </w:rPr>
+              <w:t>: white;</w:t>
             </w:r>
           </w:p>
           <w:p>
@@ -1706,24 +2193,78 @@
                 <w:sz w:val="22"/>
                 <w:szCs w:val="22"/>
               </w:rPr>
-              <w:t>.sidenav button:hover {</w:t>
-            </w:r>
-          </w:p>
-          <w:p>
-            <w:pPr>
-              <w:rPr>
-                <w:color w:val="000000" w:themeColor="text1"/>
-                <w:sz w:val="22"/>
-                <w:szCs w:val="22"/>
-              </w:rPr>
-            </w:pPr>
-            <w:r>
-              <w:rPr>
-                <w:color w:val="000000" w:themeColor="text1"/>
-                <w:sz w:val="22"/>
-                <w:szCs w:val="22"/>
-              </w:rPr>
-              <w:t>  background-color: #055CBC;</w:t>
+              <w:t>.</w:t>
+            </w:r>
+            <w:proofErr w:type="spellStart"/>
+            <w:r>
+              <w:rPr>
+                <w:color w:val="000000" w:themeColor="text1"/>
+                <w:sz w:val="22"/>
+                <w:szCs w:val="22"/>
+              </w:rPr>
+              <w:t>sidenav</w:t>
+            </w:r>
+            <w:proofErr w:type="spellEnd"/>
+            <w:r>
+              <w:rPr>
+                <w:color w:val="000000" w:themeColor="text1"/>
+                <w:sz w:val="22"/>
+                <w:szCs w:val="22"/>
+              </w:rPr>
+              <w:t xml:space="preserve"> </w:t>
+            </w:r>
+            <w:proofErr w:type="spellStart"/>
+            <w:r>
+              <w:rPr>
+                <w:color w:val="000000" w:themeColor="text1"/>
+                <w:sz w:val="22"/>
+                <w:szCs w:val="22"/>
+              </w:rPr>
+              <w:t>button:hover</w:t>
+            </w:r>
+            <w:proofErr w:type="spellEnd"/>
+            <w:r>
+              <w:rPr>
+                <w:color w:val="000000" w:themeColor="text1"/>
+                <w:sz w:val="22"/>
+                <w:szCs w:val="22"/>
+              </w:rPr>
+              <w:t xml:space="preserve"> {</w:t>
+            </w:r>
+          </w:p>
+          <w:p>
+            <w:pPr>
+              <w:rPr>
+                <w:color w:val="000000" w:themeColor="text1"/>
+                <w:sz w:val="22"/>
+                <w:szCs w:val="22"/>
+              </w:rPr>
+            </w:pPr>
+            <w:r>
+              <w:rPr>
+                <w:color w:val="000000" w:themeColor="text1"/>
+                <w:sz w:val="22"/>
+                <w:szCs w:val="22"/>
+              </w:rPr>
+              <w:t>  background-</w:t>
+            </w:r>
+            <w:proofErr w:type="spellStart"/>
+            <w:r>
+              <w:rPr>
+                <w:color w:val="000000" w:themeColor="text1"/>
+                <w:sz w:val="22"/>
+                <w:szCs w:val="22"/>
+              </w:rPr>
+              <w:t>color</w:t>
+            </w:r>
+            <w:proofErr w:type="spellEnd"/>
+            <w:r>
+              <w:rPr>
+                <w:color w:val="000000" w:themeColor="text1"/>
+                <w:sz w:val="22"/>
+                <w:szCs w:val="22"/>
+              </w:rPr>
+              <w:t>: #055CBC;</w:t>
             </w:r>
           </w:p>
           <w:p>
@@ -1814,7 +2355,25 @@
                 <w:sz w:val="22"/>
                 <w:szCs w:val="22"/>
               </w:rPr>
-              <w:t>/howto/</w:t>
+              <w:t>/</w:t>
+            </w:r>
+            <w:proofErr w:type="spellStart"/>
+            <w:r>
+              <w:rPr>
+                <w:color w:val="000000" w:themeColor="text1"/>
+                <w:sz w:val="22"/>
+                <w:szCs w:val="22"/>
+              </w:rPr>
+              <w:t>howto</w:t>
+            </w:r>
+            <w:proofErr w:type="spellEnd"/>
+            <w:r>
+              <w:rPr>
+                <w:color w:val="000000" w:themeColor="text1"/>
+                <w:sz w:val="22"/>
+                <w:szCs w:val="22"/>
+              </w:rPr>
+              <w:t>/</w:t>
             </w:r>
           </w:p>
           <w:p>
@@ -2110,6 +2669,7 @@
               </w:rPr>
               <w:t xml:space="preserve">used </w:t>
             </w:r>
+            <w:proofErr w:type="spellStart"/>
             <w:r>
               <w:rPr>
                 <w:color w:val="000000" w:themeColor="text1"/>
@@ -2118,13 +2678,68 @@
               </w:rPr>
               <w:t>chatgbt</w:t>
             </w:r>
-            <w:r>
-              <w:rPr>
-                <w:color w:val="000000" w:themeColor="text1"/>
-                <w:sz w:val="22"/>
-                <w:szCs w:val="22"/>
-              </w:rPr>
-              <w:t xml:space="preserve"> to fix issues with footer i had linked index file and main.css file witht the propts "can you please keep the footer to the bottom"</w:t>
+            <w:proofErr w:type="spellEnd"/>
+            <w:r>
+              <w:rPr>
+                <w:color w:val="000000" w:themeColor="text1"/>
+                <w:sz w:val="22"/>
+                <w:szCs w:val="22"/>
+              </w:rPr>
+              <w:t xml:space="preserve"> to fix issues with footer </w:t>
+            </w:r>
+            <w:proofErr w:type="spellStart"/>
+            <w:r>
+              <w:rPr>
+                <w:color w:val="000000" w:themeColor="text1"/>
+                <w:sz w:val="22"/>
+                <w:szCs w:val="22"/>
+              </w:rPr>
+              <w:t>i</w:t>
+            </w:r>
+            <w:proofErr w:type="spellEnd"/>
+            <w:r>
+              <w:rPr>
+                <w:color w:val="000000" w:themeColor="text1"/>
+                <w:sz w:val="22"/>
+                <w:szCs w:val="22"/>
+              </w:rPr>
+              <w:t xml:space="preserve"> had linked index file and main.css file </w:t>
+            </w:r>
+            <w:proofErr w:type="spellStart"/>
+            <w:r>
+              <w:rPr>
+                <w:color w:val="000000" w:themeColor="text1"/>
+                <w:sz w:val="22"/>
+                <w:szCs w:val="22"/>
+              </w:rPr>
+              <w:t>witht</w:t>
+            </w:r>
+            <w:proofErr w:type="spellEnd"/>
+            <w:r>
+              <w:rPr>
+                <w:color w:val="000000" w:themeColor="text1"/>
+                <w:sz w:val="22"/>
+                <w:szCs w:val="22"/>
+              </w:rPr>
+              <w:t xml:space="preserve"> the </w:t>
+            </w:r>
+            <w:proofErr w:type="spellStart"/>
+            <w:r>
+              <w:rPr>
+                <w:color w:val="000000" w:themeColor="text1"/>
+                <w:sz w:val="22"/>
+                <w:szCs w:val="22"/>
+              </w:rPr>
+              <w:t>propts</w:t>
+            </w:r>
+            <w:proofErr w:type="spellEnd"/>
+            <w:r>
+              <w:rPr>
+                <w:color w:val="000000" w:themeColor="text1"/>
+                <w:sz w:val="22"/>
+                <w:szCs w:val="22"/>
+              </w:rPr>
+              <w:t xml:space="preserve"> "can you please keep the footer to the bottom"</w:t>
             </w:r>
           </w:p>
         </w:tc>
@@ -2168,7 +2783,25 @@
                 <w:sz w:val="22"/>
                 <w:szCs w:val="22"/>
               </w:rPr>
-              <w:t>Was done in vscode so I am unable to get the original link</w:t>
+              <w:t xml:space="preserve">Was done in </w:t>
+            </w:r>
+            <w:proofErr w:type="spellStart"/>
+            <w:r>
+              <w:rPr>
+                <w:color w:val="000000" w:themeColor="text1"/>
+                <w:sz w:val="22"/>
+                <w:szCs w:val="22"/>
+              </w:rPr>
+              <w:t>vscode</w:t>
+            </w:r>
+            <w:proofErr w:type="spellEnd"/>
+            <w:r>
+              <w:rPr>
+                <w:color w:val="000000" w:themeColor="text1"/>
+                <w:sz w:val="22"/>
+                <w:szCs w:val="22"/>
+              </w:rPr>
+              <w:t xml:space="preserve"> so I am unable to get the original link</w:t>
             </w:r>
           </w:p>
         </w:tc>
@@ -2457,8 +3090,18 @@
                 <w:sz w:val="22"/>
                 <w:szCs w:val="22"/>
               </w:rPr>
-              <w:t>Weather api</w:t>
-            </w:r>
+              <w:t xml:space="preserve">Weather </w:t>
+            </w:r>
+            <w:proofErr w:type="spellStart"/>
+            <w:r>
+              <w:rPr>
+                <w:color w:val="000000" w:themeColor="text1"/>
+                <w:sz w:val="22"/>
+                <w:szCs w:val="22"/>
+              </w:rPr>
+              <w:t>api</w:t>
+            </w:r>
+            <w:proofErr w:type="spellEnd"/>
           </w:p>
         </w:tc>
         <w:tc>
@@ -2633,7 +3276,153 @@
                 <w:szCs w:val="22"/>
               </w:rPr>
               <w:lastRenderedPageBreak/>
-              <w:t>Needed a weather api</w:t>
+              <w:t xml:space="preserve">Needed a weather </w:t>
+            </w:r>
+            <w:proofErr w:type="spellStart"/>
+            <w:r>
+              <w:rPr>
+                <w:color w:val="000000" w:themeColor="text1"/>
+                <w:sz w:val="22"/>
+                <w:szCs w:val="22"/>
+              </w:rPr>
+              <w:t>api</w:t>
+            </w:r>
+            <w:proofErr w:type="spellEnd"/>
+          </w:p>
+        </w:tc>
+      </w:tr>
+      <w:tr>
+        <w:tc>
+          <w:tcPr>
+            <w:tcW w:w="2999" w:type="dxa"/>
+          </w:tcPr>
+          <w:p>
+            <w:pPr>
+              <w:rPr>
+                <w:color w:val="000000" w:themeColor="text1"/>
+                <w:sz w:val="22"/>
+                <w:szCs w:val="22"/>
+              </w:rPr>
+            </w:pPr>
+          </w:p>
+        </w:tc>
+        <w:tc>
+          <w:tcPr>
+            <w:tcW w:w="1368" w:type="dxa"/>
+          </w:tcPr>
+          <w:p>
+            <w:pPr>
+              <w:rPr>
+                <w:color w:val="000000" w:themeColor="text1"/>
+                <w:sz w:val="22"/>
+                <w:szCs w:val="22"/>
+              </w:rPr>
+            </w:pPr>
+            <w:r>
+              <w:rPr>
+                <w:color w:val="000000" w:themeColor="text1"/>
+                <w:sz w:val="22"/>
+                <w:szCs w:val="22"/>
+              </w:rPr>
+              <w:t>07/02/2025</w:t>
+            </w:r>
+          </w:p>
+          <w:p>
+            <w:pPr>
+              <w:rPr>
+                <w:color w:val="000000" w:themeColor="text1"/>
+                <w:sz w:val="22"/>
+                <w:szCs w:val="22"/>
+              </w:rPr>
+            </w:pPr>
+          </w:p>
+        </w:tc>
+        <w:tc>
+          <w:tcPr>
+            <w:tcW w:w="919" w:type="dxa"/>
+          </w:tcPr>
+          <w:p>
+            <w:pPr>
+              <w:rPr>
+                <w:color w:val="000000" w:themeColor="text1"/>
+                <w:sz w:val="22"/>
+                <w:szCs w:val="22"/>
+              </w:rPr>
+            </w:pPr>
+            <w:hyperlink r:id="rId12" w:history="1">
+              <w:proofErr w:type="spellStart"/>
+              <w:r>
+                <w:rPr>
+                  <w:rStyle w:val="Hyperlink"/>
+                  <w:sz w:val="22"/>
+                  <w:szCs w:val="22"/>
+                </w:rPr>
+                <w:t>CodePen</w:t>
+              </w:r>
+              <w:proofErr w:type="spellEnd"/>
+              <w:r>
+                <w:rPr>
+                  <w:rStyle w:val="Hyperlink"/>
+                  <w:sz w:val="22"/>
+                  <w:szCs w:val="22"/>
+                </w:rPr>
+                <w:t xml:space="preserve"> Challenge: Pull Quotes</w:t>
+              </w:r>
+            </w:hyperlink>
+          </w:p>
+        </w:tc>
+        <w:tc>
+          <w:tcPr>
+            <w:tcW w:w="4838" w:type="dxa"/>
+            <w:gridSpan w:val="2"/>
+          </w:tcPr>
+          <w:p>
+            <w:pPr>
+              <w:rPr>
+                <w:color w:val="000000" w:themeColor="text1"/>
+                <w:sz w:val="22"/>
+                <w:szCs w:val="22"/>
+              </w:rPr>
+            </w:pPr>
+          </w:p>
+        </w:tc>
+        <w:tc>
+          <w:tcPr>
+            <w:tcW w:w="1398" w:type="dxa"/>
+          </w:tcPr>
+          <w:p>
+            <w:pPr>
+              <w:rPr>
+                <w:color w:val="000000" w:themeColor="text1"/>
+                <w:sz w:val="22"/>
+                <w:szCs w:val="22"/>
+              </w:rPr>
+            </w:pPr>
+            <w:r>
+              <w:rPr>
+                <w:color w:val="000000" w:themeColor="text1"/>
+                <w:sz w:val="22"/>
+                <w:szCs w:val="22"/>
+              </w:rPr>
+              <w:t xml:space="preserve">Took pieces of </w:t>
+            </w:r>
+            <w:proofErr w:type="spellStart"/>
+            <w:r>
+              <w:rPr>
+                <w:color w:val="000000" w:themeColor="text1"/>
+                <w:sz w:val="22"/>
+                <w:szCs w:val="22"/>
+              </w:rPr>
+              <w:t>css</w:t>
+            </w:r>
+            <w:proofErr w:type="spellEnd"/>
+            <w:r>
+              <w:rPr>
+                <w:color w:val="000000" w:themeColor="text1"/>
+                <w:sz w:val="22"/>
+                <w:szCs w:val="22"/>
+              </w:rPr>
+              <w:t xml:space="preserve"> and html from free</w:t>
             </w:r>
           </w:p>
         </w:tc>
@@ -2649,12 +3438,12 @@
       </w:pPr>
     </w:p>
     <w:sectPr>
-      <w:headerReference w:type="even" r:id="rId12"/>
-      <w:headerReference w:type="default" r:id="rId13"/>
-      <w:footerReference w:type="even" r:id="rId14"/>
-      <w:footerReference w:type="default" r:id="rId15"/>
-      <w:headerReference w:type="first" r:id="rId16"/>
-      <w:footerReference w:type="first" r:id="rId17"/>
+      <w:headerReference w:type="even" r:id="rId13"/>
+      <w:headerReference w:type="default" r:id="rId14"/>
+      <w:footerReference w:type="even" r:id="rId15"/>
+      <w:footerReference w:type="default" r:id="rId16"/>
+      <w:headerReference w:type="first" r:id="rId17"/>
+      <w:footerReference w:type="first" r:id="rId18"/>
       <w:pgSz w:w="11906" w:h="16838"/>
       <w:pgMar w:top="1440" w:right="1440" w:bottom="1440" w:left="1440" w:header="708" w:footer="708" w:gutter="0"/>
       <w:cols w:space="708"/>

</xml_diff>

<commit_message>
Refactor index.html: improve formatting and readability of content and JSON body structure
</commit_message>
<xml_diff>
--- a/documentation/asset log.docx
+++ b/documentation/asset log.docx
@@ -3304,6 +3304,48 @@
                 <w:szCs w:val="22"/>
               </w:rPr>
             </w:pPr>
+            <w:r>
+              <w:rPr>
+                <w:color w:val="000000" w:themeColor="text1"/>
+                <w:sz w:val="22"/>
+                <w:szCs w:val="22"/>
+              </w:rPr>
+              <w:drawing>
+                <wp:inline distT="0" distB="0" distL="0" distR="0" wp14:anchorId="35C689F5" wp14:editId="2BB7F461">
+                  <wp:extent cx="1562986" cy="1045050"/>
+                  <wp:effectExtent l="0" t="0" r="0" b="3175"/>
+                  <wp:docPr id="1996376561" name="Picture 1"/>
+                  <wp:cNvGraphicFramePr>
+                    <a:graphicFrameLocks xmlns:a="http://schemas.openxmlformats.org/drawingml/2006/main" noChangeAspect="1"/>
+                  </wp:cNvGraphicFramePr>
+                  <a:graphic xmlns:a="http://schemas.openxmlformats.org/drawingml/2006/main">
+                    <a:graphicData uri="http://schemas.openxmlformats.org/drawingml/2006/picture">
+                      <pic:pic xmlns:pic="http://schemas.openxmlformats.org/drawingml/2006/picture">
+                        <pic:nvPicPr>
+                          <pic:cNvPr id="1996376561" name=""/>
+                          <pic:cNvPicPr/>
+                        </pic:nvPicPr>
+                        <pic:blipFill>
+                          <a:blip r:embed="rId12"/>
+                          <a:stretch>
+                            <a:fillRect/>
+                          </a:stretch>
+                        </pic:blipFill>
+                        <pic:spPr>
+                          <a:xfrm>
+                            <a:off x="0" y="0"/>
+                            <a:ext cx="1568202" cy="1048538"/>
+                          </a:xfrm>
+                          <a:prstGeom prst="rect">
+                            <a:avLst/>
+                          </a:prstGeom>
+                        </pic:spPr>
+                      </pic:pic>
+                    </a:graphicData>
+                  </a:graphic>
+                </wp:inline>
+              </w:drawing>
+            </w:r>
           </w:p>
         </w:tc>
         <w:tc>
@@ -3349,7 +3391,7 @@
                 <w:szCs w:val="22"/>
               </w:rPr>
             </w:pPr>
-            <w:hyperlink r:id="rId12" w:history="1">
+            <w:hyperlink r:id="rId13" w:history="1">
               <w:proofErr w:type="spellStart"/>
               <w:r>
                 <w:rPr>
@@ -3427,6 +3469,129 @@
           </w:p>
         </w:tc>
       </w:tr>
+      <w:tr>
+        <w:tc>
+          <w:tcPr>
+            <w:tcW w:w="2999" w:type="dxa"/>
+          </w:tcPr>
+          <w:p>
+            <w:pPr>
+              <w:rPr>
+                <w:color w:val="000000" w:themeColor="text1"/>
+                <w:sz w:val="22"/>
+                <w:szCs w:val="22"/>
+              </w:rPr>
+            </w:pPr>
+            <w:r>
+              <w:rPr>
+                <w:color w:val="000000" w:themeColor="text1"/>
+                <w:sz w:val="22"/>
+                <w:szCs w:val="22"/>
+              </w:rPr>
+              <w:drawing>
+                <wp:inline distT="0" distB="0" distL="0" distR="0" wp14:anchorId="1E120498" wp14:editId="218B3A6D">
+                  <wp:extent cx="1425172" cy="1286539"/>
+                  <wp:effectExtent l="0" t="0" r="3810" b="8890"/>
+                  <wp:docPr id="2037478712" name="Picture 1"/>
+                  <wp:cNvGraphicFramePr>
+                    <a:graphicFrameLocks xmlns:a="http://schemas.openxmlformats.org/drawingml/2006/main" noChangeAspect="1"/>
+                  </wp:cNvGraphicFramePr>
+                  <a:graphic xmlns:a="http://schemas.openxmlformats.org/drawingml/2006/main">
+                    <a:graphicData uri="http://schemas.openxmlformats.org/drawingml/2006/picture">
+                      <pic:pic xmlns:pic="http://schemas.openxmlformats.org/drawingml/2006/picture">
+                        <pic:nvPicPr>
+                          <pic:cNvPr id="2037478712" name=""/>
+                          <pic:cNvPicPr/>
+                        </pic:nvPicPr>
+                        <pic:blipFill>
+                          <a:blip r:embed="rId14"/>
+                          <a:stretch>
+                            <a:fillRect/>
+                          </a:stretch>
+                        </pic:blipFill>
+                        <pic:spPr>
+                          <a:xfrm>
+                            <a:off x="0" y="0"/>
+                            <a:ext cx="1433972" cy="1294483"/>
+                          </a:xfrm>
+                          <a:prstGeom prst="rect">
+                            <a:avLst/>
+                          </a:prstGeom>
+                        </pic:spPr>
+                      </pic:pic>
+                    </a:graphicData>
+                  </a:graphic>
+                </wp:inline>
+              </w:drawing>
+            </w:r>
+          </w:p>
+        </w:tc>
+        <w:tc>
+          <w:tcPr>
+            <w:tcW w:w="1368" w:type="dxa"/>
+          </w:tcPr>
+          <w:p>
+            <w:pPr>
+              <w:rPr>
+                <w:color w:val="000000" w:themeColor="text1"/>
+                <w:sz w:val="22"/>
+                <w:szCs w:val="22"/>
+              </w:rPr>
+            </w:pPr>
+            <w:r>
+              <w:rPr>
+                <w:color w:val="000000" w:themeColor="text1"/>
+                <w:sz w:val="22"/>
+                <w:szCs w:val="22"/>
+              </w:rPr>
+              <w:t>07/02/2025</w:t>
+            </w:r>
+          </w:p>
+        </w:tc>
+        <w:tc>
+          <w:tcPr>
+            <w:tcW w:w="919" w:type="dxa"/>
+          </w:tcPr>
+          <w:p>
+            <w:pPr>
+              <w:rPr>
+                <w:color w:val="000000" w:themeColor="text1"/>
+                <w:sz w:val="22"/>
+                <w:szCs w:val="22"/>
+              </w:rPr>
+            </w:pPr>
+          </w:p>
+        </w:tc>
+        <w:tc>
+          <w:tcPr>
+            <w:tcW w:w="4838" w:type="dxa"/>
+            <w:gridSpan w:val="2"/>
+          </w:tcPr>
+          <w:p>
+            <w:pPr>
+              <w:rPr>
+                <w:color w:val="000000" w:themeColor="text1"/>
+                <w:sz w:val="22"/>
+                <w:szCs w:val="22"/>
+              </w:rPr>
+            </w:pPr>
+          </w:p>
+        </w:tc>
+        <w:tc>
+          <w:tcPr>
+            <w:tcW w:w="1398" w:type="dxa"/>
+          </w:tcPr>
+          <w:p>
+            <w:pPr>
+              <w:rPr>
+                <w:color w:val="000000" w:themeColor="text1"/>
+                <w:sz w:val="22"/>
+                <w:szCs w:val="22"/>
+              </w:rPr>
+            </w:pPr>
+          </w:p>
+        </w:tc>
+      </w:tr>
     </w:tbl>
     <w:p>
       <w:pPr>
@@ -3438,12 +3603,12 @@
       </w:pPr>
     </w:p>
     <w:sectPr>
-      <w:headerReference w:type="even" r:id="rId13"/>
-      <w:headerReference w:type="default" r:id="rId14"/>
-      <w:footerReference w:type="even" r:id="rId15"/>
-      <w:footerReference w:type="default" r:id="rId16"/>
-      <w:headerReference w:type="first" r:id="rId17"/>
-      <w:footerReference w:type="first" r:id="rId18"/>
+      <w:headerReference w:type="even" r:id="rId15"/>
+      <w:headerReference w:type="default" r:id="rId16"/>
+      <w:footerReference w:type="even" r:id="rId17"/>
+      <w:footerReference w:type="default" r:id="rId18"/>
+      <w:headerReference w:type="first" r:id="rId19"/>
+      <w:footerReference w:type="first" r:id="rId20"/>
       <w:pgSz w:w="11906" w:h="16838"/>
       <w:pgMar w:top="1440" w:right="1440" w:bottom="1440" w:left="1440" w:header="708" w:footer="708" w:gutter="0"/>
       <w:cols w:space="708"/>

</xml_diff>